<commit_message>
nmv 06 10 2026
</commit_message>
<xml_diff>
--- a/TS-Kramam/TS-4.1/TS 4.1 Malayalam Krama Paatam Corrections.docx
+++ b/TS-Kramam/TS-4.1/TS 4.1 Malayalam Krama Paatam Corrections.docx
@@ -81,9 +81,8 @@
           <w:szCs w:val="32"/>
           <w:u w:val="single"/>
         </w:rPr>
-        <w:t xml:space="preserve">Observed </w:t>
+        <w:t xml:space="preserve">Observed till </w:t>
       </w:r>
-      <w:proofErr w:type="gramStart"/>
       <w:r>
         <w:rPr>
           <w:b/>
@@ -92,20 +91,8 @@
           <w:szCs w:val="32"/>
           <w:u w:val="single"/>
         </w:rPr>
-        <w:t xml:space="preserve">till </w:t>
+        <w:t>30th Sep 2026</w:t>
       </w:r>
-      <w:r>
-        <w:rPr>
-          <w:b/>
-          <w:bCs/>
-          <w:sz w:val="32"/>
-          <w:szCs w:val="32"/>
-          <w:highlight w:val="red"/>
-          <w:u w:val="single"/>
-        </w:rPr>
-        <w:t>????</w:t>
-      </w:r>
-      <w:proofErr w:type="gramEnd"/>
     </w:p>
     <w:p>
       <w:pPr>
@@ -308,28 +295,18 @@
                 <w:b/>
                 <w:sz w:val="28"/>
                 <w:szCs w:val="32"/>
-                <w:lang w:val="it-IT"/>
-              </w:rPr>
-            </w:pPr>
-            <w:r>
-              <w:rPr>
-                <w:rFonts w:cs="Arial"/>
-                <w:b/>
-                <w:sz w:val="28"/>
-                <w:szCs w:val="32"/>
-                <w:lang w:val="it-IT"/>
-              </w:rPr>
-              <w:t xml:space="preserve">Krama Vaakyam No. - </w:t>
-            </w:r>
-            <w:r>
-              <w:rPr>
-                <w:rFonts w:cs="Arial"/>
-                <w:b/>
-                <w:sz w:val="28"/>
-                <w:szCs w:val="32"/>
-                <w:lang w:val="it-IT"/>
-              </w:rPr>
-              <w:t>14</w:t>
+                <w:lang w:val="en-IN"/>
+              </w:rPr>
+            </w:pPr>
+            <w:r>
+              <w:rPr>
+                <w:rFonts w:cs="Arial"/>
+                <w:b/>
+                <w:sz w:val="28"/>
+                <w:szCs w:val="32"/>
+                <w:lang w:val="en-IN"/>
+              </w:rPr>
+              <w:t>Krama Vaakyam No. - 14</w:t>
             </w:r>
           </w:p>
           <w:p>
@@ -404,16 +381,16 @@
                 <w:color w:val="000000"/>
                 <w:sz w:val="40"/>
                 <w:szCs w:val="40"/>
-                <w:lang w:val="en-IN" w:eastAsia="en-IN" w:bidi="ml-IN"/>
-              </w:rPr>
-            </w:pPr>
-            <w:r>
-              <w:rPr>
-                <w:rFonts w:ascii="BRH Malayalam Extra" w:eastAsia="Times New Roman" w:hAnsi="BRH Malayalam Extra" w:cs="BRH Malayalam Extra"/>
-                <w:color w:val="000000"/>
-                <w:sz w:val="40"/>
-                <w:szCs w:val="40"/>
-                <w:lang w:val="en-IN" w:eastAsia="en-IN" w:bidi="ml-IN"/>
+                <w:lang w:val="it-IT" w:eastAsia="en-IN" w:bidi="ml-IN"/>
+              </w:rPr>
+            </w:pPr>
+            <w:r>
+              <w:rPr>
+                <w:rFonts w:ascii="BRH Malayalam Extra" w:eastAsia="Times New Roman" w:hAnsi="BRH Malayalam Extra" w:cs="BRH Malayalam Extra"/>
+                <w:color w:val="000000"/>
+                <w:sz w:val="40"/>
+                <w:szCs w:val="40"/>
+                <w:lang w:val="it-IT" w:eastAsia="en-IN" w:bidi="ml-IN"/>
               </w:rPr>
               <w:t>ix pd</w:t>
             </w:r>
@@ -423,17 +400,17 @@
                 <w:color w:val="000000"/>
                 <w:sz w:val="32"/>
                 <w:szCs w:val="40"/>
-                <w:lang w:val="en-IN" w:eastAsia="en-IN" w:bidi="ml-IN"/>
-              </w:rPr>
-              <w:t>–</w:t>
-            </w:r>
-            <w:r>
-              <w:rPr>
-                <w:rFonts w:ascii="BRH Malayalam Extra" w:eastAsia="Times New Roman" w:hAnsi="BRH Malayalam Extra" w:cs="BRH Malayalam Extra"/>
-                <w:color w:val="000000"/>
-                <w:sz w:val="40"/>
-                <w:szCs w:val="40"/>
-                <w:lang w:val="en-IN" w:eastAsia="en-IN" w:bidi="ml-IN"/>
+                <w:lang w:val="it-IT" w:eastAsia="en-IN" w:bidi="ml-IN"/>
+              </w:rPr>
+              <w:t>–</w:t>
+            </w:r>
+            <w:r>
+              <w:rPr>
+                <w:rFonts w:ascii="BRH Malayalam Extra" w:eastAsia="Times New Roman" w:hAnsi="BRH Malayalam Extra" w:cs="BRH Malayalam Extra"/>
+                <w:color w:val="000000"/>
+                <w:sz w:val="40"/>
+                <w:szCs w:val="40"/>
+                <w:lang w:val="it-IT" w:eastAsia="en-IN" w:bidi="ml-IN"/>
               </w:rPr>
               <w:t xml:space="preserve">sðZz©— | </w:t>
             </w:r>
@@ -450,16 +427,16 @@
                 <w:color w:val="000000"/>
                 <w:sz w:val="40"/>
                 <w:szCs w:val="40"/>
-                <w:lang w:val="en-IN" w:eastAsia="en-IN" w:bidi="ml-IN"/>
-              </w:rPr>
-            </w:pPr>
-            <w:r>
-              <w:rPr>
-                <w:rFonts w:ascii="BRH Malayalam Extra" w:eastAsia="Times New Roman" w:hAnsi="BRH Malayalam Extra" w:cs="BRH Malayalam Extra"/>
-                <w:color w:val="000000"/>
-                <w:sz w:val="40"/>
-                <w:szCs w:val="40"/>
-                <w:lang w:val="en-IN" w:eastAsia="en-IN" w:bidi="ml-IN"/>
+                <w:lang w:val="it-IT" w:eastAsia="en-IN" w:bidi="ml-IN"/>
+              </w:rPr>
+            </w:pPr>
+            <w:r>
+              <w:rPr>
+                <w:rFonts w:ascii="BRH Malayalam Extra" w:eastAsia="Times New Roman" w:hAnsi="BRH Malayalam Extra" w:cs="BRH Malayalam Extra"/>
+                <w:color w:val="000000"/>
+                <w:sz w:val="40"/>
+                <w:szCs w:val="40"/>
+                <w:lang w:val="it-IT" w:eastAsia="en-IN" w:bidi="ml-IN"/>
               </w:rPr>
               <w:t>pd</w:t>
             </w:r>
@@ -469,17 +446,17 @@
                 <w:color w:val="000000"/>
                 <w:sz w:val="32"/>
                 <w:szCs w:val="40"/>
-                <w:lang w:val="en-IN" w:eastAsia="en-IN" w:bidi="ml-IN"/>
-              </w:rPr>
-              <w:t>–</w:t>
-            </w:r>
-            <w:r>
-              <w:rPr>
-                <w:rFonts w:ascii="BRH Malayalam Extra" w:eastAsia="Times New Roman" w:hAnsi="BRH Malayalam Extra" w:cs="BRH Malayalam Extra"/>
-                <w:color w:val="000000"/>
-                <w:sz w:val="40"/>
-                <w:szCs w:val="40"/>
-                <w:lang w:val="en-IN" w:eastAsia="en-IN" w:bidi="ml-IN"/>
+                <w:lang w:val="it-IT" w:eastAsia="en-IN" w:bidi="ml-IN"/>
+              </w:rPr>
+              <w:t>–</w:t>
+            </w:r>
+            <w:r>
+              <w:rPr>
+                <w:rFonts w:ascii="BRH Malayalam Extra" w:eastAsia="Times New Roman" w:hAnsi="BRH Malayalam Extra" w:cs="BRH Malayalam Extra"/>
+                <w:color w:val="000000"/>
+                <w:sz w:val="40"/>
+                <w:szCs w:val="40"/>
+                <w:lang w:val="it-IT" w:eastAsia="en-IN" w:bidi="ml-IN"/>
               </w:rPr>
               <w:t>sðZz</w:t>
             </w:r>
@@ -489,17 +466,17 @@
                 <w:color w:val="000000"/>
                 <w:sz w:val="32"/>
                 <w:szCs w:val="40"/>
-                <w:lang w:val="en-IN" w:eastAsia="en-IN" w:bidi="ml-IN"/>
-              </w:rPr>
-              <w:t>–</w:t>
-            </w:r>
-            <w:r>
-              <w:rPr>
-                <w:rFonts w:ascii="BRH Malayalam Extra" w:eastAsia="Times New Roman" w:hAnsi="BRH Malayalam Extra" w:cs="BRH Malayalam Extra"/>
-                <w:color w:val="000000"/>
-                <w:sz w:val="40"/>
-                <w:szCs w:val="40"/>
-                <w:lang w:val="en-IN" w:eastAsia="en-IN" w:bidi="ml-IN"/>
+                <w:lang w:val="it-IT" w:eastAsia="en-IN" w:bidi="ml-IN"/>
+              </w:rPr>
+              <w:t>–</w:t>
+            </w:r>
+            <w:r>
+              <w:rPr>
+                <w:rFonts w:ascii="BRH Malayalam Extra" w:eastAsia="Times New Roman" w:hAnsi="BRH Malayalam Extra" w:cs="BRH Malayalam Extra"/>
+                <w:color w:val="000000"/>
+                <w:sz w:val="40"/>
+                <w:szCs w:val="40"/>
+                <w:lang w:val="it-IT" w:eastAsia="en-IN" w:bidi="ml-IN"/>
               </w:rPr>
               <w:t>dy</w:t>
             </w:r>
@@ -510,7 +487,7 @@
                 <w:sz w:val="40"/>
                 <w:szCs w:val="40"/>
                 <w:highlight w:val="yellow"/>
-                <w:lang w:val="en-IN" w:eastAsia="en-IN" w:bidi="ml-IN"/>
+                <w:lang w:val="it-IT" w:eastAsia="en-IN" w:bidi="ml-IN"/>
               </w:rPr>
               <w:t>Zy</w:t>
             </w:r>
@@ -520,7 +497,7 @@
                 <w:color w:val="000000"/>
                 <w:sz w:val="40"/>
                 <w:szCs w:val="40"/>
-                <w:lang w:val="en-IN" w:eastAsia="en-IN" w:bidi="ml-IN"/>
+                <w:lang w:val="it-IT" w:eastAsia="en-IN" w:bidi="ml-IN"/>
               </w:rPr>
               <w:t>— pd</w:t>
             </w:r>
@@ -530,17 +507,17 @@
                 <w:color w:val="000000"/>
                 <w:sz w:val="32"/>
                 <w:szCs w:val="40"/>
-                <w:lang w:val="en-IN" w:eastAsia="en-IN" w:bidi="ml-IN"/>
-              </w:rPr>
-              <w:t>–</w:t>
-            </w:r>
-            <w:r>
-              <w:rPr>
-                <w:rFonts w:ascii="BRH Malayalam Extra" w:eastAsia="Times New Roman" w:hAnsi="BRH Malayalam Extra" w:cs="BRH Malayalam Extra"/>
-                <w:color w:val="000000"/>
-                <w:sz w:val="40"/>
-                <w:szCs w:val="40"/>
-                <w:lang w:val="en-IN" w:eastAsia="en-IN" w:bidi="ml-IN"/>
+                <w:lang w:val="it-IT" w:eastAsia="en-IN" w:bidi="ml-IN"/>
+              </w:rPr>
+              <w:t>–</w:t>
+            </w:r>
+            <w:r>
+              <w:rPr>
+                <w:rFonts w:ascii="BRH Malayalam Extra" w:eastAsia="Times New Roman" w:hAnsi="BRH Malayalam Extra" w:cs="BRH Malayalam Extra"/>
+                <w:color w:val="000000"/>
+                <w:sz w:val="40"/>
+                <w:szCs w:val="40"/>
+                <w:lang w:val="it-IT" w:eastAsia="en-IN" w:bidi="ml-IN"/>
               </w:rPr>
               <w:t>sðZz©— ||</w:t>
             </w:r>
@@ -568,16 +545,16 @@
                 <w:color w:val="000000"/>
                 <w:sz w:val="40"/>
                 <w:szCs w:val="40"/>
-                <w:lang w:val="en-IN" w:eastAsia="en-IN" w:bidi="ml-IN"/>
-              </w:rPr>
-            </w:pPr>
-            <w:r>
-              <w:rPr>
-                <w:rFonts w:ascii="BRH Malayalam Extra" w:eastAsia="Times New Roman" w:hAnsi="BRH Malayalam Extra" w:cs="BRH Malayalam Extra"/>
-                <w:color w:val="000000"/>
-                <w:sz w:val="40"/>
-                <w:szCs w:val="40"/>
-                <w:lang w:val="en-IN" w:eastAsia="en-IN" w:bidi="ml-IN"/>
+                <w:lang w:val="it-IT" w:eastAsia="en-IN" w:bidi="ml-IN"/>
+              </w:rPr>
+            </w:pPr>
+            <w:r>
+              <w:rPr>
+                <w:rFonts w:ascii="BRH Malayalam Extra" w:eastAsia="Times New Roman" w:hAnsi="BRH Malayalam Extra" w:cs="BRH Malayalam Extra"/>
+                <w:color w:val="000000"/>
+                <w:sz w:val="40"/>
+                <w:szCs w:val="40"/>
+                <w:lang w:val="it-IT" w:eastAsia="en-IN" w:bidi="ml-IN"/>
               </w:rPr>
               <w:t>ix pd</w:t>
             </w:r>
@@ -587,17 +564,17 @@
                 <w:color w:val="000000"/>
                 <w:sz w:val="32"/>
                 <w:szCs w:val="40"/>
-                <w:lang w:val="en-IN" w:eastAsia="en-IN" w:bidi="ml-IN"/>
-              </w:rPr>
-              <w:t>–</w:t>
-            </w:r>
-            <w:r>
-              <w:rPr>
-                <w:rFonts w:ascii="BRH Malayalam Extra" w:eastAsia="Times New Roman" w:hAnsi="BRH Malayalam Extra" w:cs="BRH Malayalam Extra"/>
-                <w:color w:val="000000"/>
-                <w:sz w:val="40"/>
-                <w:szCs w:val="40"/>
-                <w:lang w:val="en-IN" w:eastAsia="en-IN" w:bidi="ml-IN"/>
+                <w:lang w:val="it-IT" w:eastAsia="en-IN" w:bidi="ml-IN"/>
+              </w:rPr>
+              <w:t>–</w:t>
+            </w:r>
+            <w:r>
+              <w:rPr>
+                <w:rFonts w:ascii="BRH Malayalam Extra" w:eastAsia="Times New Roman" w:hAnsi="BRH Malayalam Extra" w:cs="BRH Malayalam Extra"/>
+                <w:color w:val="000000"/>
+                <w:sz w:val="40"/>
+                <w:szCs w:val="40"/>
+                <w:lang w:val="it-IT" w:eastAsia="en-IN" w:bidi="ml-IN"/>
               </w:rPr>
               <w:t xml:space="preserve">sðZz©— | </w:t>
             </w:r>
@@ -614,16 +591,16 @@
                 <w:color w:val="000000"/>
                 <w:sz w:val="40"/>
                 <w:szCs w:val="40"/>
-                <w:lang w:val="en-IN" w:eastAsia="en-IN" w:bidi="ml-IN"/>
-              </w:rPr>
-            </w:pPr>
-            <w:r>
-              <w:rPr>
-                <w:rFonts w:ascii="BRH Malayalam Extra" w:eastAsia="Times New Roman" w:hAnsi="BRH Malayalam Extra" w:cs="BRH Malayalam Extra"/>
-                <w:color w:val="000000"/>
-                <w:sz w:val="40"/>
-                <w:szCs w:val="40"/>
-                <w:lang w:val="en-IN" w:eastAsia="en-IN" w:bidi="ml-IN"/>
+                <w:lang w:val="it-IT" w:eastAsia="en-IN" w:bidi="ml-IN"/>
+              </w:rPr>
+            </w:pPr>
+            <w:r>
+              <w:rPr>
+                <w:rFonts w:ascii="BRH Malayalam Extra" w:eastAsia="Times New Roman" w:hAnsi="BRH Malayalam Extra" w:cs="BRH Malayalam Extra"/>
+                <w:color w:val="000000"/>
+                <w:sz w:val="40"/>
+                <w:szCs w:val="40"/>
+                <w:lang w:val="it-IT" w:eastAsia="en-IN" w:bidi="ml-IN"/>
               </w:rPr>
               <w:t>pd</w:t>
             </w:r>
@@ -633,17 +610,17 @@
                 <w:color w:val="000000"/>
                 <w:sz w:val="32"/>
                 <w:szCs w:val="40"/>
-                <w:lang w:val="en-IN" w:eastAsia="en-IN" w:bidi="ml-IN"/>
-              </w:rPr>
-              <w:t>–</w:t>
-            </w:r>
-            <w:r>
-              <w:rPr>
-                <w:rFonts w:ascii="BRH Malayalam Extra" w:eastAsia="Times New Roman" w:hAnsi="BRH Malayalam Extra" w:cs="BRH Malayalam Extra"/>
-                <w:color w:val="000000"/>
-                <w:sz w:val="40"/>
-                <w:szCs w:val="40"/>
-                <w:lang w:val="en-IN" w:eastAsia="en-IN" w:bidi="ml-IN"/>
+                <w:lang w:val="it-IT" w:eastAsia="en-IN" w:bidi="ml-IN"/>
+              </w:rPr>
+              <w:t>–</w:t>
+            </w:r>
+            <w:r>
+              <w:rPr>
+                <w:rFonts w:ascii="BRH Malayalam Extra" w:eastAsia="Times New Roman" w:hAnsi="BRH Malayalam Extra" w:cs="BRH Malayalam Extra"/>
+                <w:color w:val="000000"/>
+                <w:sz w:val="40"/>
+                <w:szCs w:val="40"/>
+                <w:lang w:val="it-IT" w:eastAsia="en-IN" w:bidi="ml-IN"/>
               </w:rPr>
               <w:t>sðZz</w:t>
             </w:r>
@@ -653,17 +630,17 @@
                 <w:color w:val="000000"/>
                 <w:sz w:val="32"/>
                 <w:szCs w:val="40"/>
-                <w:lang w:val="en-IN" w:eastAsia="en-IN" w:bidi="ml-IN"/>
-              </w:rPr>
-              <w:t>–</w:t>
-            </w:r>
-            <w:r>
-              <w:rPr>
-                <w:rFonts w:ascii="BRH Malayalam Extra" w:eastAsia="Times New Roman" w:hAnsi="BRH Malayalam Extra" w:cs="BRH Malayalam Extra"/>
-                <w:color w:val="000000"/>
-                <w:sz w:val="40"/>
-                <w:szCs w:val="40"/>
-                <w:lang w:val="en-IN" w:eastAsia="en-IN" w:bidi="ml-IN"/>
+                <w:lang w:val="it-IT" w:eastAsia="en-IN" w:bidi="ml-IN"/>
+              </w:rPr>
+              <w:t>–</w:t>
+            </w:r>
+            <w:r>
+              <w:rPr>
+                <w:rFonts w:ascii="BRH Malayalam Extra" w:eastAsia="Times New Roman" w:hAnsi="BRH Malayalam Extra" w:cs="BRH Malayalam Extra"/>
+                <w:color w:val="000000"/>
+                <w:sz w:val="40"/>
+                <w:szCs w:val="40"/>
+                <w:lang w:val="it-IT" w:eastAsia="en-IN" w:bidi="ml-IN"/>
               </w:rPr>
               <w:t>dy</w:t>
             </w:r>
@@ -674,7 +651,7 @@
                 <w:sz w:val="40"/>
                 <w:szCs w:val="40"/>
                 <w:highlight w:val="green"/>
-                <w:lang w:val="en-IN" w:eastAsia="en-IN" w:bidi="ml-IN"/>
+                <w:lang w:val="it-IT" w:eastAsia="en-IN" w:bidi="ml-IN"/>
               </w:rPr>
               <w:t>Zy</w:t>
             </w:r>
@@ -684,17 +661,17 @@
                 <w:color w:val="000000"/>
                 <w:sz w:val="32"/>
                 <w:szCs w:val="40"/>
-                <w:lang w:val="en-IN" w:eastAsia="en-IN" w:bidi="ml-IN"/>
-              </w:rPr>
-              <w:t>–</w:t>
-            </w:r>
-            <w:r>
-              <w:rPr>
-                <w:rFonts w:ascii="BRH Malayalam Extra" w:eastAsia="Times New Roman" w:hAnsi="BRH Malayalam Extra" w:cs="BRH Malayalam Extra"/>
-                <w:color w:val="000000"/>
-                <w:sz w:val="40"/>
-                <w:szCs w:val="40"/>
-                <w:lang w:val="en-IN" w:eastAsia="en-IN" w:bidi="ml-IN"/>
+                <w:lang w:val="it-IT" w:eastAsia="en-IN" w:bidi="ml-IN"/>
+              </w:rPr>
+              <w:t>–</w:t>
+            </w:r>
+            <w:r>
+              <w:rPr>
+                <w:rFonts w:ascii="BRH Malayalam Extra" w:eastAsia="Times New Roman" w:hAnsi="BRH Malayalam Extra" w:cs="BRH Malayalam Extra"/>
+                <w:color w:val="000000"/>
+                <w:sz w:val="40"/>
+                <w:szCs w:val="40"/>
+                <w:lang w:val="it-IT" w:eastAsia="en-IN" w:bidi="ml-IN"/>
               </w:rPr>
               <w:t xml:space="preserve"> pd</w:t>
             </w:r>
@@ -704,17 +681,17 @@
                 <w:color w:val="000000"/>
                 <w:sz w:val="32"/>
                 <w:szCs w:val="40"/>
-                <w:lang w:val="en-IN" w:eastAsia="en-IN" w:bidi="ml-IN"/>
-              </w:rPr>
-              <w:t>–</w:t>
-            </w:r>
-            <w:r>
-              <w:rPr>
-                <w:rFonts w:ascii="BRH Malayalam Extra" w:eastAsia="Times New Roman" w:hAnsi="BRH Malayalam Extra" w:cs="BRH Malayalam Extra"/>
-                <w:color w:val="000000"/>
-                <w:sz w:val="40"/>
-                <w:szCs w:val="40"/>
-                <w:lang w:val="en-IN" w:eastAsia="en-IN" w:bidi="ml-IN"/>
+                <w:lang w:val="it-IT" w:eastAsia="en-IN" w:bidi="ml-IN"/>
+              </w:rPr>
+              <w:t>–</w:t>
+            </w:r>
+            <w:r>
+              <w:rPr>
+                <w:rFonts w:ascii="BRH Malayalam Extra" w:eastAsia="Times New Roman" w:hAnsi="BRH Malayalam Extra" w:cs="BRH Malayalam Extra"/>
+                <w:color w:val="000000"/>
+                <w:sz w:val="40"/>
+                <w:szCs w:val="40"/>
+                <w:lang w:val="it-IT" w:eastAsia="en-IN" w:bidi="ml-IN"/>
               </w:rPr>
               <w:t>sðZz©— ||</w:t>
             </w:r>
@@ -2252,96 +2229,6 @@
           </w:p>
         </w:tc>
       </w:tr>
-      <w:tr>
-        <w:trPr>
-          <w:trHeight w:val="962"/>
-        </w:trPr>
-        <w:tc>
-          <w:tcPr>
-            <w:tcW w:w="3999" w:type="dxa"/>
-            <w:gridSpan w:val="2"/>
-            <w:tcBorders>
-              <w:top w:val="single" w:sz="4" w:space="0" w:color="000000"/>
-              <w:left w:val="single" w:sz="4" w:space="0" w:color="000000"/>
-              <w:bottom w:val="single" w:sz="4" w:space="0" w:color="000000"/>
-              <w:right w:val="single" w:sz="4" w:space="0" w:color="000000"/>
-            </w:tcBorders>
-          </w:tcPr>
-          <w:p>
-            <w:pPr>
-              <w:widowControl w:val="0"/>
-              <w:tabs>
-                <w:tab w:val="left" w:pos="993"/>
-              </w:tabs>
-              <w:autoSpaceDE w:val="0"/>
-              <w:autoSpaceDN w:val="0"/>
-              <w:adjustRightInd w:val="0"/>
-              <w:spacing w:before="0" w:line="252" w:lineRule="auto"/>
-              <w:ind w:right="297"/>
-              <w:rPr>
-                <w:rFonts w:cs="Arial"/>
-                <w:b/>
-                <w:sz w:val="28"/>
-                <w:szCs w:val="32"/>
-              </w:rPr>
-            </w:pPr>
-          </w:p>
-        </w:tc>
-        <w:tc>
-          <w:tcPr>
-            <w:tcW w:w="5103" w:type="dxa"/>
-            <w:tcBorders>
-              <w:top w:val="single" w:sz="4" w:space="0" w:color="000000"/>
-              <w:left w:val="single" w:sz="4" w:space="0" w:color="000000"/>
-              <w:bottom w:val="single" w:sz="4" w:space="0" w:color="000000"/>
-              <w:right w:val="single" w:sz="4" w:space="0" w:color="000000"/>
-            </w:tcBorders>
-          </w:tcPr>
-          <w:p>
-            <w:pPr>
-              <w:widowControl w:val="0"/>
-              <w:autoSpaceDE w:val="0"/>
-              <w:autoSpaceDN w:val="0"/>
-              <w:adjustRightInd w:val="0"/>
-              <w:spacing w:before="0" w:line="240" w:lineRule="auto"/>
-              <w:rPr>
-                <w:rFonts w:ascii="BRH Malayalam Extra" w:eastAsia="Times New Roman" w:hAnsi="BRH Malayalam Extra" w:cs="BRH Malayalam Extra"/>
-                <w:color w:val="000000"/>
-                <w:sz w:val="40"/>
-                <w:szCs w:val="40"/>
-                <w:lang w:val="en-IN" w:eastAsia="en-IN" w:bidi="ml-IN"/>
-              </w:rPr>
-            </w:pPr>
-          </w:p>
-        </w:tc>
-        <w:tc>
-          <w:tcPr>
-            <w:tcW w:w="5386" w:type="dxa"/>
-            <w:tcBorders>
-              <w:top w:val="single" w:sz="4" w:space="0" w:color="000000"/>
-              <w:left w:val="single" w:sz="4" w:space="0" w:color="000000"/>
-              <w:bottom w:val="single" w:sz="4" w:space="0" w:color="000000"/>
-              <w:right w:val="single" w:sz="4" w:space="0" w:color="000000"/>
-            </w:tcBorders>
-          </w:tcPr>
-          <w:p>
-            <w:pPr>
-              <w:widowControl w:val="0"/>
-              <w:autoSpaceDE w:val="0"/>
-              <w:autoSpaceDN w:val="0"/>
-              <w:adjustRightInd w:val="0"/>
-              <w:spacing w:before="0" w:line="240" w:lineRule="auto"/>
-              <w:rPr>
-                <w:rFonts w:ascii="BRH Malayalam Extra" w:eastAsia="Times New Roman" w:hAnsi="BRH Malayalam Extra" w:cs="BRH Malayalam Extra"/>
-                <w:color w:val="000000"/>
-                <w:sz w:val="40"/>
-                <w:szCs w:val="40"/>
-                <w:lang w:val="en-IN" w:eastAsia="en-IN" w:bidi="ml-IN"/>
-              </w:rPr>
-            </w:pPr>
-          </w:p>
-        </w:tc>
-      </w:tr>
     </w:tbl>
     <w:p>
       <w:pPr>
@@ -2354,10 +2241,7 @@
           <w:u w:val="single"/>
         </w:rPr>
       </w:pPr>
-    </w:p>
-    <w:p>
-      <w:pPr>
-        <w:jc w:val="center"/>
+      <w:r>
         <w:rPr>
           <w:b/>
           <w:bCs/>
@@ -2365,31 +2249,8 @@
           <w:szCs w:val="32"/>
           <w:u w:val="single"/>
         </w:rPr>
-      </w:pPr>
-    </w:p>
-    <w:p>
-      <w:pPr>
-        <w:jc w:val="center"/>
-        <w:rPr>
-          <w:b/>
-          <w:bCs/>
-          <w:sz w:val="32"/>
-          <w:szCs w:val="32"/>
-          <w:u w:val="single"/>
-        </w:rPr>
-      </w:pPr>
-    </w:p>
-    <w:p>
-      <w:pPr>
-        <w:jc w:val="center"/>
-        <w:rPr>
-          <w:b/>
-          <w:bCs/>
-          <w:sz w:val="32"/>
-          <w:szCs w:val="32"/>
-          <w:u w:val="single"/>
-        </w:rPr>
-      </w:pPr>
+        <w:t>=========</w:t>
+      </w:r>
     </w:p>
     <w:p>
       <w:pPr>
@@ -2410,6 +2271,7 @@
           <w:szCs w:val="32"/>
           <w:u w:val="single"/>
         </w:rPr>
+        <w:lastRenderedPageBreak/>
         <w:t xml:space="preserve">TS </w:t>
       </w:r>
       <w:r>
@@ -3768,7 +3630,6 @@
               </w:rPr>
               <w:t>¥²</w:t>
             </w:r>
-            <w:proofErr w:type="gramStart"/>
             <w:r>
               <w:rPr>
                 <w:rFonts w:ascii="BRH Malayalam Extra" w:eastAsia="Times New Roman" w:hAnsi="BRH Malayalam Extra" w:cs="BRH Malayalam Extra"/>
@@ -3798,18 +3659,7 @@
                 <w:szCs w:val="40"/>
                 <w:lang w:val="en-IN" w:eastAsia="en-IN" w:bidi="ml-IN"/>
               </w:rPr>
-              <w:t xml:space="preserve"> CZõ</w:t>
-            </w:r>
-            <w:proofErr w:type="gramEnd"/>
-            <w:r>
-              <w:rPr>
-                <w:rFonts w:ascii="BRH Malayalam Extra" w:eastAsia="Times New Roman" w:hAnsi="BRH Malayalam Extra" w:cs="BRH Malayalam Extra"/>
-                <w:color w:val="000000"/>
-                <w:sz w:val="40"/>
-                <w:szCs w:val="40"/>
-                <w:lang w:val="en-IN" w:eastAsia="en-IN" w:bidi="ml-IN"/>
-              </w:rPr>
-              <w:t>—¥² ||</w:t>
+              <w:t xml:space="preserve"> CZõ—¥² ||</w:t>
             </w:r>
           </w:p>
         </w:tc>
@@ -3869,7 +3719,6 @@
               </w:rPr>
               <w:t>²</w:t>
             </w:r>
-            <w:proofErr w:type="gramStart"/>
             <w:r>
               <w:rPr>
                 <w:rFonts w:ascii="BRH Malayalam Extra" w:eastAsia="Times New Roman" w:hAnsi="BRH Malayalam Extra" w:cs="BRH Malayalam Extra"/>
@@ -3899,18 +3748,7 @@
                 <w:szCs w:val="40"/>
                 <w:lang w:val="en-IN" w:eastAsia="en-IN" w:bidi="ml-IN"/>
               </w:rPr>
-              <w:t xml:space="preserve"> CZõ</w:t>
-            </w:r>
-            <w:proofErr w:type="gramEnd"/>
-            <w:r>
-              <w:rPr>
-                <w:rFonts w:ascii="BRH Malayalam Extra" w:eastAsia="Times New Roman" w:hAnsi="BRH Malayalam Extra" w:cs="BRH Malayalam Extra"/>
-                <w:color w:val="000000"/>
-                <w:sz w:val="40"/>
-                <w:szCs w:val="40"/>
-                <w:lang w:val="en-IN" w:eastAsia="en-IN" w:bidi="ml-IN"/>
-              </w:rPr>
-              <w:t>—¥² ||</w:t>
+              <w:t xml:space="preserve"> CZõ—¥² ||</w:t>
             </w:r>
           </w:p>
         </w:tc>
@@ -4312,7 +4150,6 @@
                 <w:sz w:val="28"/>
                 <w:szCs w:val="32"/>
               </w:rPr>
-              <w:lastRenderedPageBreak/>
               <w:t>T.S.4.1.</w:t>
             </w:r>
             <w:r>
@@ -4742,6 +4579,7 @@
           <w:szCs w:val="32"/>
           <w:u w:val="single"/>
         </w:rPr>
+        <w:lastRenderedPageBreak/>
         <w:t xml:space="preserve">TS Krama Paatam – TS 4.1 Malayalam Corrections – Observed till </w:t>
       </w:r>
       <w:r>
@@ -6048,7 +5886,6 @@
                 <w:sz w:val="28"/>
                 <w:szCs w:val="32"/>
               </w:rPr>
-              <w:lastRenderedPageBreak/>
               <w:t>Panchaati No</w:t>
             </w:r>
             <w:r>
@@ -6103,7 +5940,6 @@
                 <w:szCs w:val="40"/>
                 <w:lang w:val="en-IN" w:eastAsia="en-IN" w:bidi="ml-IN"/>
               </w:rPr>
-              <w:lastRenderedPageBreak/>
               <w:t>D</w:t>
             </w:r>
             <w:r>
@@ -6952,6 +6788,7 @@
                 <w:sz w:val="28"/>
                 <w:szCs w:val="32"/>
               </w:rPr>
+              <w:lastRenderedPageBreak/>
               <w:t>T.S.4.1.8.5 – Kramam</w:t>
             </w:r>
           </w:p>
@@ -8399,7 +8236,6 @@
                 <w:szCs w:val="40"/>
                 <w:lang w:val="en-IN" w:eastAsia="en-IN" w:bidi="ml-IN"/>
               </w:rPr>
-              <w:lastRenderedPageBreak/>
               <w:t>s</w:t>
             </w:r>
             <w:r>
@@ -8530,7 +8366,6 @@
                 <w:szCs w:val="40"/>
                 <w:lang w:val="en-IN" w:eastAsia="en-IN" w:bidi="ml-IN"/>
               </w:rPr>
-              <w:lastRenderedPageBreak/>
               <w:t>s</w:t>
             </w:r>
             <w:r>
@@ -8659,7 +8494,6 @@
                 <w:szCs w:val="40"/>
                 <w:lang w:val="en-IN" w:eastAsia="en-IN" w:bidi="ml-IN"/>
               </w:rPr>
-              <w:lastRenderedPageBreak/>
               <w:t>s</w:t>
             </w:r>
             <w:r>
@@ -8789,7 +8623,6 @@
                 <w:sz w:val="28"/>
                 <w:szCs w:val="32"/>
               </w:rPr>
-              <w:lastRenderedPageBreak/>
               <w:t>T.S.4.1.11.3 – Kramam</w:t>
             </w:r>
           </w:p>
@@ -9043,16 +8876,7 @@
           <w:bCs/>
           <w:sz w:val="32"/>
         </w:rPr>
-        <w:t xml:space="preserve">replaced </w:t>
-      </w:r>
-      <w:proofErr w:type="gramStart"/>
-      <w:r>
-        <w:rPr>
-          <w:b/>
-          <w:bCs/>
-          <w:sz w:val="32"/>
-        </w:rPr>
-        <w:t>with</w:t>
+        <w:t>replaced with</w:t>
       </w:r>
       <w:r>
         <w:rPr>
@@ -9074,7 +8898,6 @@
         </w:rPr>
         <w:t>"</w:t>
       </w:r>
-      <w:proofErr w:type="gramEnd"/>
       <w:r>
         <w:rPr>
           <w:rFonts w:ascii="BRH Malayalam" w:hAnsi="BRH Malayalam" w:cs="BRH Malayalam"/>
@@ -9086,7 +8909,6 @@
         </w:rPr>
         <w:t>q§T</w:t>
       </w:r>
-      <w:proofErr w:type="gramStart"/>
       <w:r>
         <w:rPr>
           <w:rFonts w:ascii="BRH Malayalam" w:hAnsi="BRH Malayalam" w:cs="BRH Malayalam"/>
@@ -9103,16 +8925,7 @@
           <w:bCs/>
           <w:sz w:val="32"/>
         </w:rPr>
-        <w:t>wherever</w:t>
-      </w:r>
-      <w:proofErr w:type="gramEnd"/>
-      <w:r>
-        <w:rPr>
-          <w:b/>
-          <w:bCs/>
-          <w:sz w:val="32"/>
-        </w:rPr>
-        <w:t xml:space="preserve"> applicable</w:t>
+        <w:t>wherever applicable</w:t>
       </w:r>
     </w:p>
     <w:p>
@@ -9168,6 +8981,7 @@
           <w:szCs w:val="32"/>
           <w:u w:val="single"/>
         </w:rPr>
+        <w:lastRenderedPageBreak/>
         <w:t xml:space="preserve">TS </w:t>
       </w:r>
       <w:r>
@@ -10045,7 +9859,6 @@
           <w:b/>
           <w:sz w:val="36"/>
         </w:rPr>
-        <w:lastRenderedPageBreak/>
         <w:t>========================</w:t>
       </w:r>
     </w:p>

</xml_diff>